<commit_message>
Auto commit local changes Sun 23/08/2026 23:56
</commit_message>
<xml_diff>
--- a/custom instructions/CODEX_BRIEF_INSTRUCTIONS_CHATGPT_ONLY.docx
+++ b/custom instructions/CODEX_BRIEF_INSTRUCTIONS_CHATGPT_ONLY.docx
@@ -206,34 +206,7 @@
         <w:widowControl/>
       </w:pPr>
       <w:r>
-        <w:t xml:space="preserve">Exact PowerShell launch snippet. Provide a separate fenced </w:t>
-      </w:r>
-      <w:r>
-        <w:rPr>
-          <w:rStyle w:val="CodeChar"/>
-        </w:rPr>
-        <w:t>powershell</w:t>
-      </w:r>
-      <w:r>
-        <w:t xml:space="preserve"> block that sets the repository location, reads the named brief with </w:t>
-      </w:r>
-      <w:r>
-        <w:rPr>
-          <w:rStyle w:val="CodeChar"/>
-        </w:rPr>
-        <w:t>Get-Content -Raw</w:t>
-      </w:r>
-      <w:r>
-        <w:t xml:space="preserve">, and launches interactive </w:t>
-      </w:r>
-      <w:r>
-        <w:rPr>
-          <w:rStyle w:val="CodeChar"/>
-        </w:rPr>
-        <w:t>codex</w:t>
-      </w:r>
-      <w:r>
-        <w:t xml:space="preserve"> with the exact recommended model and reasoning value. The delivered command must contain the actual brief filename, model slug, and reasoning value, with no placeholders. This is a concrete syntax example using an actual brief filename:</w:t>
+        <w:t>Exact PowerShell launch snippet. Provide a separate fenced powershell block that sets the repository location and launches interactive codex with the exact recommended model and reasoning value, followed by a short literal prompt telling Codex to read the named brief completely and carry out every requirement. Never load the brief into a PowerShell variable or pass its multiline contents to codex; that method can be misparsed as CLI arguments. The delivered command must contain the actual brief filename, model slug, and reasoning value, with no placeholders. Example:</w:t>
       </w:r>
     </w:p>
     <w:p>
@@ -246,41 +219,19 @@
         <w:ind w:left="216" w:right="216"/>
       </w:pPr>
       <w:r>
-        <w:rPr>
-          <w:rStyle w:val="CodeChar"/>
-        </w:rPr>
-        <w:t>Set-Location C:\GPT\CODEX-master</w:t>
+        <w:t>Set-Location "C:\GPT\CODEX-master"</w:t>
       </w:r>
     </w:p>
     <w:p>
       <w:pPr>
         <w:pStyle w:val="CodeBlock"/>
-        <w:spacing w:before="0" w:after="0" w:line="240" w:lineRule="auto"/>
-        <w:keepNext/>
+        <w:spacing w:before="0" w:after="120" w:line="240" w:lineRule="auto"/>
         <w:widowControl/>
         <w:shd w:val="clear" w:color="auto" w:fill="F2F4F7"/>
         <w:ind w:left="216" w:right="216"/>
       </w:pPr>
       <w:r>
-        <w:rPr>
-          <w:rStyle w:val="CodeChar"/>
-        </w:rPr>
-        <w:t>$brief = Get-Content -Raw -LiteralPath ".\CODEX_BRIEF_2026-08-10_Trading_Tools_Journal_Pine.txt"</w:t>
-      </w:r>
-    </w:p>
-    <w:p>
-      <w:pPr>
-        <w:pStyle w:val="CodeBlock"/>
-        <w:spacing w:before="0" w:after="120" w:line="240" w:lineRule="auto"/>
-        <w:widowControl/>
-        <w:shd w:val="clear" w:color="auto" w:fill="F2F4F7"/>
-        <w:ind w:left="216" w:right="216"/>
-      </w:pPr>
-      <w:r>
-        <w:rPr>
-          <w:rStyle w:val="CodeChar"/>
-        </w:rPr>
-        <w:t>codex --model gpt-5.6-sol --config 'model_reasoning_effort="ultra"' $brief</w:t>
+        <w:t>codex --model gpt-5.6-sol --config 'model_reasoning_effort="ultra"' 'Read .\CODEX_BRIEF_2026-08-10_Trading_Tools_Journal_Pine.txt completely, then carry out every requirement in it.'</w:t>
       </w:r>
     </w:p>
     <w:p>
@@ -306,10 +257,7 @@
         <w:ind w:left="216" w:right="216"/>
       </w:pPr>
       <w:r>
-        <w:rPr>
-          <w:rStyle w:val="CodeChar"/>
-        </w:rPr>
-        <w:t>Set-Location C:\GPT\CODEX-master</w:t>
+        <w:t>Set-Location "C:\GPT\CODEX-master"</w:t>
       </w:r>
     </w:p>
     <w:p>
@@ -861,7 +809,7 @@
     <w:basedOn w:val="Normal"/>
     <w:qFormat/>
     <w:pPr>
-      <w:spacing w:after="80" w:line="300" w:lineRule="auto"/>
+      <w:spacing w:after="60" w:line="276" w:lineRule="auto"/>
     </w:pPr>
   </w:style>
   <w:style w:type="paragraph" w:styleId="ListNumber">

</xml_diff>